<commit_message>
Rubric: move the Collaborative Team Rubric baseline to Meeting 3 with framing
The rubric measures overall team functioning, not norm-adherence — so it now
lives at Meeting 3 (Team Self-Assessment) as the baseline, with mirror/not-a-grade
framing and a silent-first protocol. Meeting 2's Developing Specific Norms
worksheet reframes 'make it measurable' around checking the norms themselves and
points to M3 for the rubric baseline; removed the rubric from M2's resource list
and 'rate now' direction. Re-scored at a buffer meeting and Meeting 18.

Co-Authored-By: Claude Opus 4.8 <noreply@anthropic.com>
</commit_message>
<xml_diff>
--- a/public/templates/ems-developing-norms.docx
+++ b/public/templates/ems-developing-norms.docx
@@ -1452,7 +1452,7 @@
           <w:sz w:val="22"/>
           <w:szCs w:val="22"/>
         </w:rPr>
-        <w:t xml:space="preserve">Norms are only measurable if you check them. Score your team on the Collaborative Team Rubric now, and set a date to re-score.</w:t>
+        <w:t xml:space="preserve">Your norms only matter if you check them. Decide how you'll know you're keeping them — for example, a quick thumbs check against your norms at the end of a meeting, or a norm your timekeeper watches for.</w:t>
       </w:r>
     </w:p>
     <w:p>
@@ -1469,7 +1469,7 @@
           <w:sz w:val="22"/>
           <w:szCs w:val="22"/>
         </w:rPr>
-        <w:t xml:space="preserve">Our starting level on the Collaborative Team Rubric:  </w:t>
+        <w:t xml:space="preserve">How we'll check we're keeping our norms:  </w:t>
       </w:r>
     </w:p>
     <w:p>
@@ -1486,24 +1486,23 @@
           <w:sz w:val="22"/>
           <w:szCs w:val="22"/>
         </w:rPr>
-        <w:t xml:space="preserve">Date we'll re-score the rubric:  </w:t>
-      </w:r>
-    </w:p>
-    <w:p>
-      <w:pPr>
-        <w:pBdr>
-          <w:bottom w:val="single" w:color="94A3B8" w:sz="4" w:space="6"/>
-        </w:pBdr>
-        <w:spacing w:after="110" w:before="110"/>
-      </w:pPr>
-      <w:r>
-        <w:rPr>
-          <w:rFonts w:ascii="Calibri" w:cs="Calibri" w:eastAsia="Calibri" w:hAnsi="Calibri"/>
-          <w:color w:val="1F2933"/>
-          <w:sz w:val="22"/>
-          <w:szCs w:val="22"/>
-        </w:rPr>
         <w:t xml:space="preserve">Where we keep this worksheet (team's shared cycle folder):  </w:t>
+      </w:r>
+    </w:p>
+    <w:p>
+      <w:pPr>
+        <w:spacing w:after="80"/>
+      </w:pPr>
+      <w:r>
+        <w:rPr>
+          <w:rFonts w:ascii="Calibri" w:cs="Calibri" w:eastAsia="Calibri" w:hAnsi="Calibri"/>
+          <w:i/>
+          <w:iCs/>
+          <w:color w:val="64748B"/>
+          <w:sz w:val="18"/>
+          <w:szCs w:val="18"/>
+        </w:rPr>
+        <w:t xml:space="preserve">Bigger picture: the Collaborative Team Rubric gives a broader read on how your team is functioning overall — it's a companion to these norms, not a grade on them. You'll take that baseline at Meeting 3 and re-score it across the year to watch your team grow.</w:t>
       </w:r>
     </w:p>
     <w:p>

</xml_diff>